<commit_message>
Add AI-attributed explanation of the idle-bed reasoning
Adds a second "AI Says" paragraph to the memo explaining why tomatoes
stop at 10 for diminishing-returns reasons while carrots and mesclun
stop early at 19/28 for a discrete-labor-block reason, with the
numbers behind it. Adds a matching AI note to the brief explaining
why the original 47-bed hypothesis's 17 idle beds weren't actually
justified by either mechanism.

Both additions are clearly attributed as AI commentary, kept separate
from the recommendation, reflection, and hypothesis text, per
AGENTS.md.

Co-Authored-By: Claude Sonnet 5 <noreply@anthropic.com>
Claude-Session: https://claude.ai/code/session_0193ctjE1BmKKDS27QJFA479
</commit_message>
<xml_diff>
--- a/analysis/figures/Nicolina-Perfect Competition Memo and Reflection.docx
+++ b/analysis/figures/Nicolina-Perfect Competition Memo and Reflection.docx
@@ -15,8 +15,163 @@
           <w:sz w:val="30"/>
           <w:szCs w:val="30"/>
         </w:rPr>
-        <w:t>Memo</w:t>
+        <w:t xml:space="preserve">Memo to Farm Owner</w:t>
       </w:r>
+    </w:p>
+    <w:p>
+      <w:pPr>
+        <w:spacing w:after="160" w:line="276" w:lineRule="auto"/>
+        <w:rPr>
+          <w:rFonts w:ascii="Georgia" w:eastAsia="Georgia" w:hAnsi="Georgia" w:cs="Georgia"/>
+          <w:sz w:val="21"/>
+          <w:szCs w:val="21"/>
+        </w:rPr>
+      </w:pPr>
+      <w:r>
+        <w:rPr>
+          <w:rFonts w:ascii="Georgia" w:eastAsia="Georgia" w:hAnsi="Georgia" w:cs="Georgia"/>
+          <w:sz w:val="21"/>
+          <w:szCs w:val="21"/>
+        </w:rPr>
+        <w:t xml:space="preserve">Recommendation: plant 10 beds of tomatoes, 19 of carrots, and 28 of mesclun </w:t>
+      </w:r>
+    </w:p>
+    <w:p>
+      <w:pPr>
+        <w:spacing w:after="160" w:line="276" w:lineRule="auto"/>
+        <w:rPr>
+          <w:rFonts w:ascii="Georgia" w:eastAsia="Georgia" w:hAnsi="Georgia" w:cs="Georgia"/>
+          <w:sz w:val="21"/>
+          <w:szCs w:val="21"/>
+        </w:rPr>
+      </w:pPr>
+      <w:r>
+        <w:rPr>
+          <w:rFonts w:ascii="Georgia" w:eastAsia="Georgia" w:hAnsi="Georgia" w:cs="Georgia"/>
+          <w:sz w:val="21"/>
+          <w:szCs w:val="21"/>
+        </w:rPr>
+        <w:t xml:space="preserve">That uses 57 of the 64 beds </w:t>
+      </w:r>
+    </w:p>
+    <w:p>
+      <w:pPr>
+        <w:spacing w:after="160" w:line="276" w:lineRule="auto"/>
+        <w:rPr>
+          <w:rFonts w:ascii="Georgia" w:eastAsia="Georgia" w:hAnsi="Georgia" w:cs="Georgia"/>
+          <w:sz w:val="21"/>
+          <w:szCs w:val="21"/>
+        </w:rPr>
+      </w:pPr>
+      <w:r>
+        <w:rPr>
+          <w:rFonts w:ascii="Georgia" w:eastAsia="Georgia" w:hAnsi="Georgia" w:cs="Georgia"/>
+          <w:sz w:val="21"/>
+          <w:szCs w:val="21"/>
+        </w:rPr>
+        <w:t xml:space="preserve">3 temporary workers </w:t>
+      </w:r>
+    </w:p>
+    <w:p>
+      <w:pPr>
+        <w:spacing w:after="160" w:line="276" w:lineRule="auto"/>
+        <w:rPr>
+          <w:rFonts w:ascii="Georgia" w:eastAsia="Georgia" w:hAnsi="Georgia" w:cs="Georgia"/>
+          <w:sz w:val="21"/>
+          <w:szCs w:val="21"/>
+        </w:rPr>
+      </w:pPr>
+      <w:r>
+        <w:rPr>
+          <w:rFonts w:ascii="Georgia" w:eastAsia="Georgia" w:hAnsi="Georgia" w:cs="Georgia"/>
+          <w:sz w:val="21"/>
+          <w:szCs w:val="21"/>
+        </w:rPr>
+        <w:t xml:space="preserve">Profit of $16,586. </w:t>
+      </w:r>
+    </w:p>
+    <w:p>
+      <w:pPr>
+        <w:spacing w:after="160" w:line="276" w:lineRule="auto"/>
+      </w:pPr>
+      <w:r>
+        <w:rPr>
+          <w:rFonts w:ascii="Georgia" w:eastAsia="Georgia" w:hAnsi="Georgia" w:cs="Georgia"/>
+          <w:sz w:val="21"/>
+          <w:szCs w:val="21"/>
+        </w:rPr>
+        <w:t xml:space="preserve">Tomatoes stop at 10: on the 10th bed ($8,249 marginal cost against an $8,800 price), but the 11th would cost $9,391 to grow, so growing it would lose money even though tomatoes are the highest-priced crop </w:t>
+      </w:r>
+    </w:p>
+    <w:p>
+      <w:pPr>
+        <w:spacing w:after="160" w:line="276" w:lineRule="auto"/>
+        <w:rPr>
+          <w:rFonts w:ascii="Georgia" w:eastAsia="Georgia" w:hAnsi="Georgia" w:cs="Georgia"/>
+          <w:sz w:val="21"/>
+          <w:szCs w:val="21"/>
+        </w:rPr>
+      </w:pPr>
+      <w:r>
+        <w:rPr>
+          <w:rFonts w:ascii="Georgia" w:eastAsia="Georgia" w:hAnsi="Georgia" w:cs="Georgia"/>
+          <w:sz w:val="21"/>
+          <w:szCs w:val="21"/>
+        </w:rPr>
+        <w:t xml:space="preserve">Carrots and mesclun both spot before  20- and 30-bed caps. At bed 20, carrots would still make money by about $353. At bed 30, mesclun profits about $246. If more growing space becomes available, I would add more carrots.  You don’t need to worry about a fourth worker constraining this plan; both </w:t>
+      </w:r>
+    </w:p>
+    <w:p>
+      <w:pPr>
+        <w:spacing w:after="160" w:line="276" w:lineRule="auto"/>
+        <w:rPr>
+          <w:rFonts w:ascii="Georgia" w:eastAsia="Georgia" w:hAnsi="Georgia" w:cs="Georgia"/>
+          <w:sz w:val="21"/>
+          <w:szCs w:val="21"/>
+        </w:rPr>
+      </w:pPr>
+      <w:r>
+        <w:rPr>
+          <w:rFonts w:ascii="Georgia" w:eastAsia="Georgia" w:hAnsi="Georgia" w:cs="Georgia"/>
+          <w:sz w:val="21"/>
+          <w:szCs w:val="21"/>
+        </w:rPr>
+        <w:t xml:space="preserve">AI Says: If labor is available at $17.36, the better plan pushes carrots and mesclun all the way to caps (60 beds). But labor is not actually hired that way — it comes in whole 1,440-hour blocks — and going to 60 beds would mean paying for a fourth worker’s largely idle time. That is why the recommendation above holds at 57 beds rather than 60: it is the plan that wins once real hiring lumps are priced in, not the smooth-labor ideal. If flexible or part-time labor becomes available, this recommendation should be revisited.</w:t>
+      </w:r>
+    </w:p>
+    <w:p>
+      <w:pPr>
+        <w:spacing w:after="160" w:line="276" w:lineRule="auto"/>
+        <w:rPr>
+          <w:rFonts w:ascii="Georgia" w:eastAsia="Georgia" w:hAnsi="Georgia" w:cs="Georgia"/>
+          <w:sz w:val="21"/>
+          <w:szCs w:val="21"/>
+        </w:rPr>
+      </w:pPr>
+      <w:r>
+        <w:rPr>
+          <w:rFonts w:ascii="Georgia" w:eastAsia="Georgia" w:hAnsi="Georgia" w:cs="Georgia"/>
+          <w:sz w:val="21"/>
+          <w:szCs w:val="21"/>
+        </w:rPr>
+        <w:t xml:space="preserve">AI Says — filling in why the split isn’t one story: tomatoes stop at 10 on diminishing returns alone, bed 11’s own marginal cost ($9,391) already exceeds its $8,800 price, no labor-hiring nuance needed. Carrots and mesclun are different: at 19 and 28 beds, the farm has already used 5,029 of the 5,040 hours the farmer and her 3 temp workers provide together, about 10 hours of slack. Priced smoothly, carrot bed 20 would still earn about $406 on its own, and mesclun bed 29 about $313. But taking any one of them pushes total hours past 5,040 and forces hiring a whole fourth worker ($25,000 for 1,440 hours) to cover it, which is why adding any single one of these three beds actually lowers total profit (tomato bed 11: −$17,080; carrot bed 20: −$23,346; mesclun bed 29: −$23,180), even though carrots and mesclun look profitable bed-by-bed in isolation. The farm isn’t out of hireable labor, a fourth worker is allowed; it’s that the next available block of labor costs more than what’s left to grow can earn.</w:t>
+      </w:r>
+    </w:p>
+    <w:p>
+      <w:pPr>
+        <w:spacing w:after="160" w:line="276" w:lineRule="auto"/>
+        <w:rPr>
+          <w:rFonts w:ascii="Georgia" w:eastAsia="Georgia" w:hAnsi="Georgia" w:cs="Georgia"/>
+          <w:sz w:val="21"/>
+          <w:szCs w:val="21"/>
+        </w:rPr>
+      </w:pPr>
+    </w:p>
+    <w:p>
+      <w:pPr>
+        <w:spacing w:after="240"/>
+        <w:jc w:val="center"/>
+      </w:pPr>
       <w:r>
         <w:rPr>
           <w:rFonts w:ascii="Georgia" w:eastAsia="Georgia" w:hAnsi="Georgia" w:cs="Georgia"/>
@@ -25,564 +180,23 @@
           <w:sz w:val="30"/>
           <w:szCs w:val="30"/>
         </w:rPr>
-        <w:t xml:space="preserve"> to Farm Owner</w:t>
+        <w:t xml:space="preserve">Reflection </w:t>
       </w:r>
     </w:p>
     <w:p>
       <w:pPr>
-        <w:spacing w:after="160" w:line="276" w:lineRule="auto"/>
-        <w:rPr>
-          <w:rFonts w:ascii="Georgia" w:eastAsia="Georgia" w:hAnsi="Georgia" w:cs="Georgia"/>
-          <w:sz w:val="21"/>
-          <w:szCs w:val="21"/>
-        </w:rPr>
+        <w:pStyle w:val="NormalWeb"/>
       </w:pPr>
       <w:r>
-        <w:rPr>
-          <w:rFonts w:ascii="Georgia" w:eastAsia="Georgia" w:hAnsi="Georgia" w:cs="Georgia"/>
-          <w:sz w:val="21"/>
-          <w:szCs w:val="21"/>
-        </w:rPr>
-        <w:t xml:space="preserve">Recommendation: plant 10 beds of tomatoes, 19 of carrots, and 28 of mesclun </w:t>
+        <w:t xml:space="preserve">My original hypothesis (7 tomatoes / 18 carrots / 22 mesclun, 47 beds) was too conservative on every crop, only making $5,252 but way less than the 10 / 19 / 28 split.</w:t>
       </w:r>
     </w:p>
     <w:p>
       <w:pPr>
-        <w:spacing w:after="160" w:line="276" w:lineRule="auto"/>
-        <w:rPr>
-          <w:rFonts w:ascii="Georgia" w:eastAsia="Georgia" w:hAnsi="Georgia" w:cs="Georgia"/>
-          <w:sz w:val="21"/>
-          <w:szCs w:val="21"/>
-        </w:rPr>
+        <w:pStyle w:val="NormalWeb"/>
       </w:pPr>
       <w:r>
-        <w:rPr>
-          <w:rFonts w:ascii="Georgia" w:eastAsia="Georgia" w:hAnsi="Georgia" w:cs="Georgia"/>
-          <w:sz w:val="21"/>
-          <w:szCs w:val="21"/>
-        </w:rPr>
-        <w:t xml:space="preserve">That uses </w:t>
-      </w:r>
-      <w:r>
-        <w:rPr>
-          <w:rFonts w:ascii="Georgia" w:eastAsia="Georgia" w:hAnsi="Georgia" w:cs="Georgia"/>
-          <w:sz w:val="21"/>
-          <w:szCs w:val="21"/>
-        </w:rPr>
-        <w:t xml:space="preserve">57 of the 64 beds </w:t>
-      </w:r>
-    </w:p>
-    <w:p>
-      <w:pPr>
-        <w:spacing w:after="160" w:line="276" w:lineRule="auto"/>
-        <w:rPr>
-          <w:rFonts w:ascii="Georgia" w:eastAsia="Georgia" w:hAnsi="Georgia" w:cs="Georgia"/>
-          <w:sz w:val="21"/>
-          <w:szCs w:val="21"/>
-        </w:rPr>
-      </w:pPr>
-      <w:r>
-        <w:rPr>
-          <w:rFonts w:ascii="Georgia" w:eastAsia="Georgia" w:hAnsi="Georgia" w:cs="Georgia"/>
-          <w:sz w:val="21"/>
-          <w:szCs w:val="21"/>
-        </w:rPr>
-        <w:t xml:space="preserve">3 temporary workers </w:t>
-      </w:r>
-    </w:p>
-    <w:p>
-      <w:pPr>
-        <w:spacing w:after="160" w:line="276" w:lineRule="auto"/>
-        <w:rPr>
-          <w:rFonts w:ascii="Georgia" w:eastAsia="Georgia" w:hAnsi="Georgia" w:cs="Georgia"/>
-          <w:sz w:val="21"/>
-          <w:szCs w:val="21"/>
-        </w:rPr>
-      </w:pPr>
-      <w:r>
-        <w:rPr>
-          <w:rFonts w:ascii="Georgia" w:eastAsia="Georgia" w:hAnsi="Georgia" w:cs="Georgia"/>
-          <w:sz w:val="21"/>
-          <w:szCs w:val="21"/>
-        </w:rPr>
-        <w:t>P</w:t>
-      </w:r>
-      <w:r>
-        <w:rPr>
-          <w:rFonts w:ascii="Georgia" w:eastAsia="Georgia" w:hAnsi="Georgia" w:cs="Georgia"/>
-          <w:sz w:val="21"/>
-          <w:szCs w:val="21"/>
-        </w:rPr>
-        <w:t xml:space="preserve">rofit of $16,586. </w:t>
-      </w:r>
-    </w:p>
-    <w:p>
-      <w:pPr>
-        <w:spacing w:after="160" w:line="276" w:lineRule="auto"/>
-      </w:pPr>
-      <w:r>
-        <w:rPr>
-          <w:rFonts w:ascii="Georgia" w:eastAsia="Georgia" w:hAnsi="Georgia" w:cs="Georgia"/>
-          <w:sz w:val="21"/>
-          <w:szCs w:val="21"/>
-        </w:rPr>
-        <w:t>Tomatoes stop at 10</w:t>
-      </w:r>
-      <w:r>
-        <w:rPr>
-          <w:rFonts w:ascii="Georgia" w:eastAsia="Georgia" w:hAnsi="Georgia" w:cs="Georgia"/>
-          <w:sz w:val="21"/>
-          <w:szCs w:val="21"/>
-        </w:rPr>
-        <w:t xml:space="preserve">: </w:t>
-      </w:r>
-      <w:r>
-        <w:rPr>
-          <w:rFonts w:ascii="Georgia" w:eastAsia="Georgia" w:hAnsi="Georgia" w:cs="Georgia"/>
-          <w:sz w:val="21"/>
-          <w:szCs w:val="21"/>
-        </w:rPr>
-        <w:t xml:space="preserve">on the 10th bed ($8,249 marginal cost against an $8,800 price), but the 11th would cost $9,391 to grow, so growing it would lose money </w:t>
-      </w:r>
-      <w:r>
-        <w:rPr>
-          <w:rFonts w:ascii="Georgia" w:eastAsia="Georgia" w:hAnsi="Georgia" w:cs="Georgia"/>
-          <w:sz w:val="21"/>
-          <w:szCs w:val="21"/>
-        </w:rPr>
-        <w:t>even though</w:t>
-      </w:r>
-      <w:r>
-        <w:rPr>
-          <w:rFonts w:ascii="Georgia" w:eastAsia="Georgia" w:hAnsi="Georgia" w:cs="Georgia"/>
-          <w:sz w:val="21"/>
-          <w:szCs w:val="21"/>
-        </w:rPr>
-        <w:t xml:space="preserve"> tomatoes </w:t>
-      </w:r>
-      <w:r>
-        <w:rPr>
-          <w:rFonts w:ascii="Georgia" w:eastAsia="Georgia" w:hAnsi="Georgia" w:cs="Georgia"/>
-          <w:sz w:val="21"/>
-          <w:szCs w:val="21"/>
-        </w:rPr>
-        <w:t>are</w:t>
-      </w:r>
-      <w:r>
-        <w:rPr>
-          <w:rFonts w:ascii="Georgia" w:eastAsia="Georgia" w:hAnsi="Georgia" w:cs="Georgia"/>
-          <w:sz w:val="21"/>
-          <w:szCs w:val="21"/>
-        </w:rPr>
-        <w:t xml:space="preserve"> the highest-priced crop </w:t>
-      </w:r>
-    </w:p>
-    <w:p>
-      <w:pPr>
-        <w:spacing w:after="160" w:line="276" w:lineRule="auto"/>
-        <w:rPr>
-          <w:rFonts w:ascii="Georgia" w:eastAsia="Georgia" w:hAnsi="Georgia" w:cs="Georgia"/>
-          <w:sz w:val="21"/>
-          <w:szCs w:val="21"/>
-        </w:rPr>
-      </w:pPr>
-      <w:r>
-        <w:rPr>
-          <w:rFonts w:ascii="Georgia" w:eastAsia="Georgia" w:hAnsi="Georgia" w:cs="Georgia"/>
-          <w:sz w:val="21"/>
-          <w:szCs w:val="21"/>
-        </w:rPr>
-        <w:t>C</w:t>
-      </w:r>
-      <w:r>
-        <w:rPr>
-          <w:rFonts w:ascii="Georgia" w:eastAsia="Georgia" w:hAnsi="Georgia" w:cs="Georgia"/>
-          <w:sz w:val="21"/>
-          <w:szCs w:val="21"/>
-        </w:rPr>
-        <w:t xml:space="preserve">arrots and mesclun both </w:t>
-      </w:r>
-      <w:r>
-        <w:rPr>
-          <w:rFonts w:ascii="Georgia" w:eastAsia="Georgia" w:hAnsi="Georgia" w:cs="Georgia"/>
-          <w:sz w:val="21"/>
-          <w:szCs w:val="21"/>
-        </w:rPr>
-        <w:t xml:space="preserve">spot </w:t>
-      </w:r>
-      <w:proofErr w:type="gramStart"/>
-      <w:r>
-        <w:rPr>
-          <w:rFonts w:ascii="Georgia" w:eastAsia="Georgia" w:hAnsi="Georgia" w:cs="Georgia"/>
-          <w:sz w:val="21"/>
-          <w:szCs w:val="21"/>
-        </w:rPr>
-        <w:t xml:space="preserve">before </w:t>
-      </w:r>
-      <w:r>
-        <w:rPr>
-          <w:rFonts w:ascii="Georgia" w:eastAsia="Georgia" w:hAnsi="Georgia" w:cs="Georgia"/>
-          <w:sz w:val="21"/>
-          <w:szCs w:val="21"/>
-        </w:rPr>
-        <w:t xml:space="preserve"> 20</w:t>
-      </w:r>
-      <w:proofErr w:type="gramEnd"/>
-      <w:r>
-        <w:rPr>
-          <w:rFonts w:ascii="Georgia" w:eastAsia="Georgia" w:hAnsi="Georgia" w:cs="Georgia"/>
-          <w:sz w:val="21"/>
-          <w:szCs w:val="21"/>
-        </w:rPr>
-        <w:t>- and 30-bed caps</w:t>
-      </w:r>
-      <w:r>
-        <w:rPr>
-          <w:rFonts w:ascii="Georgia" w:eastAsia="Georgia" w:hAnsi="Georgia" w:cs="Georgia"/>
-          <w:sz w:val="21"/>
-          <w:szCs w:val="21"/>
-        </w:rPr>
-        <w:t>. A</w:t>
-      </w:r>
-      <w:r>
-        <w:rPr>
-          <w:rFonts w:ascii="Georgia" w:eastAsia="Georgia" w:hAnsi="Georgia" w:cs="Georgia"/>
-          <w:sz w:val="21"/>
-          <w:szCs w:val="21"/>
-        </w:rPr>
-        <w:t xml:space="preserve">t bed 20, carrots would still </w:t>
-      </w:r>
-      <w:r>
-        <w:rPr>
-          <w:rFonts w:ascii="Georgia" w:eastAsia="Georgia" w:hAnsi="Georgia" w:cs="Georgia"/>
-          <w:sz w:val="21"/>
-          <w:szCs w:val="21"/>
-        </w:rPr>
-        <w:t>make money</w:t>
-      </w:r>
-      <w:r>
-        <w:rPr>
-          <w:rFonts w:ascii="Georgia" w:eastAsia="Georgia" w:hAnsi="Georgia" w:cs="Georgia"/>
-          <w:sz w:val="21"/>
-          <w:szCs w:val="21"/>
-        </w:rPr>
-        <w:t xml:space="preserve"> by about $353</w:t>
-      </w:r>
-      <w:r>
-        <w:rPr>
-          <w:rFonts w:ascii="Georgia" w:eastAsia="Georgia" w:hAnsi="Georgia" w:cs="Georgia"/>
-          <w:sz w:val="21"/>
-          <w:szCs w:val="21"/>
-        </w:rPr>
-        <w:t>. A</w:t>
-      </w:r>
-      <w:r>
-        <w:rPr>
-          <w:rFonts w:ascii="Georgia" w:eastAsia="Georgia" w:hAnsi="Georgia" w:cs="Georgia"/>
-          <w:sz w:val="21"/>
-          <w:szCs w:val="21"/>
-        </w:rPr>
-        <w:t xml:space="preserve">t bed 30, mesclun </w:t>
-      </w:r>
-      <w:r>
-        <w:rPr>
-          <w:rFonts w:ascii="Georgia" w:eastAsia="Georgia" w:hAnsi="Georgia" w:cs="Georgia"/>
-          <w:sz w:val="21"/>
-          <w:szCs w:val="21"/>
-        </w:rPr>
-        <w:t>profits</w:t>
-      </w:r>
-      <w:r>
-        <w:rPr>
-          <w:rFonts w:ascii="Georgia" w:eastAsia="Georgia" w:hAnsi="Georgia" w:cs="Georgia"/>
-          <w:sz w:val="21"/>
-          <w:szCs w:val="21"/>
-        </w:rPr>
-        <w:t xml:space="preserve"> about $246. If more growing space becomes available, </w:t>
-      </w:r>
-      <w:r>
-        <w:rPr>
-          <w:rFonts w:ascii="Georgia" w:eastAsia="Georgia" w:hAnsi="Georgia" w:cs="Georgia"/>
-          <w:sz w:val="21"/>
-          <w:szCs w:val="21"/>
-        </w:rPr>
-        <w:t xml:space="preserve">I would add more carrots. </w:t>
-      </w:r>
-      <w:r>
-        <w:rPr>
-          <w:rFonts w:ascii="Georgia" w:eastAsia="Georgia" w:hAnsi="Georgia" w:cs="Georgia"/>
-          <w:sz w:val="21"/>
-          <w:szCs w:val="21"/>
-        </w:rPr>
-        <w:t xml:space="preserve"> </w:t>
-      </w:r>
-      <w:r>
-        <w:rPr>
-          <w:rFonts w:ascii="Georgia" w:eastAsia="Georgia" w:hAnsi="Georgia" w:cs="Georgia"/>
-          <w:sz w:val="21"/>
-          <w:szCs w:val="21"/>
-        </w:rPr>
-        <w:t xml:space="preserve">You don’t need to worry about </w:t>
-      </w:r>
-      <w:r>
-        <w:rPr>
-          <w:rFonts w:ascii="Georgia" w:eastAsia="Georgia" w:hAnsi="Georgia" w:cs="Georgia"/>
-          <w:sz w:val="21"/>
-          <w:szCs w:val="21"/>
-        </w:rPr>
-        <w:t xml:space="preserve">a fourth worker constraining this plan; both </w:t>
-      </w:r>
-    </w:p>
-    <w:p>
-      <w:pPr>
-        <w:spacing w:after="160" w:line="276" w:lineRule="auto"/>
-        <w:rPr>
-          <w:rFonts w:ascii="Georgia" w:eastAsia="Georgia" w:hAnsi="Georgia" w:cs="Georgia"/>
-          <w:sz w:val="21"/>
-          <w:szCs w:val="21"/>
-        </w:rPr>
-      </w:pPr>
-      <w:r>
-        <w:rPr>
-          <w:rFonts w:ascii="Georgia" w:eastAsia="Georgia" w:hAnsi="Georgia" w:cs="Georgia"/>
-          <w:sz w:val="21"/>
-          <w:szCs w:val="21"/>
-        </w:rPr>
-        <w:t xml:space="preserve">AI Says: If </w:t>
-      </w:r>
-      <w:r>
-        <w:rPr>
-          <w:rFonts w:ascii="Georgia" w:eastAsia="Georgia" w:hAnsi="Georgia" w:cs="Georgia"/>
-          <w:sz w:val="21"/>
-          <w:szCs w:val="21"/>
-        </w:rPr>
-        <w:t xml:space="preserve">labor </w:t>
-      </w:r>
-      <w:r>
-        <w:rPr>
-          <w:rFonts w:ascii="Georgia" w:eastAsia="Georgia" w:hAnsi="Georgia" w:cs="Georgia"/>
-          <w:sz w:val="21"/>
-          <w:szCs w:val="21"/>
-        </w:rPr>
-        <w:t>is</w:t>
-      </w:r>
-      <w:r>
-        <w:rPr>
-          <w:rFonts w:ascii="Georgia" w:eastAsia="Georgia" w:hAnsi="Georgia" w:cs="Georgia"/>
-          <w:sz w:val="21"/>
-          <w:szCs w:val="21"/>
-        </w:rPr>
-        <w:t xml:space="preserve"> available at $17.36</w:t>
-      </w:r>
-      <w:r>
-        <w:rPr>
-          <w:rFonts w:ascii="Georgia" w:eastAsia="Georgia" w:hAnsi="Georgia" w:cs="Georgia"/>
-          <w:sz w:val="21"/>
-          <w:szCs w:val="21"/>
-        </w:rPr>
-        <w:t xml:space="preserve">, </w:t>
-      </w:r>
-      <w:r>
-        <w:rPr>
-          <w:rFonts w:ascii="Georgia" w:eastAsia="Georgia" w:hAnsi="Georgia" w:cs="Georgia"/>
-          <w:sz w:val="21"/>
-          <w:szCs w:val="21"/>
-        </w:rPr>
-        <w:t>the better plan pushes carrots and mesclun all the way to caps (60 beds). But labor is not actually hired that way — it comes in whole 1,440-hour blocks — and going to 60 beds would mean paying for a fourth worker’s largely idle time. That is why the recommendation above holds at 57 beds rather than 60: it is the plan that wins once real hiring lumps are priced in, not the smooth-labor ideal. If flexible or part-time labor becomes available, this recommendation should be revisited.</w:t>
-      </w:r>
-    </w:p>
-    <w:p>
-      <w:pPr>
-        <w:spacing w:after="160" w:line="276" w:lineRule="auto"/>
-        <w:rPr>
-          <w:rFonts w:ascii="Georgia" w:eastAsia="Georgia" w:hAnsi="Georgia" w:cs="Georgia"/>
-          <w:sz w:val="21"/>
-          <w:szCs w:val="21"/>
-        </w:rPr>
-      </w:pPr>
-    </w:p>
-    <w:p>
-      <w:pPr>
-        <w:spacing w:after="240"/>
-        <w:jc w:val="center"/>
-      </w:pPr>
-      <w:r>
-        <w:rPr>
-          <w:rFonts w:ascii="Georgia" w:eastAsia="Georgia" w:hAnsi="Georgia" w:cs="Georgia"/>
-          <w:b/>
-          <w:bCs/>
-          <w:sz w:val="30"/>
-          <w:szCs w:val="30"/>
-        </w:rPr>
-        <w:t>Reflection</w:t>
-      </w:r>
-      <w:r>
-        <w:rPr>
-          <w:rFonts w:ascii="Georgia" w:eastAsia="Georgia" w:hAnsi="Georgia" w:cs="Georgia"/>
-          <w:b/>
-          <w:bCs/>
-          <w:sz w:val="30"/>
-          <w:szCs w:val="30"/>
-        </w:rPr>
-        <w:t xml:space="preserve"> </w:t>
-      </w:r>
-    </w:p>
-    <w:p>
-      <w:pPr>
-        <w:pStyle w:val="NormalWeb"/>
-      </w:pPr>
-      <w:r>
-        <w:t>My original hypothesis (7 tomatoes / 18 carrots / 22 mesclun, 47 beds) was too conservative on every crop</w:t>
-      </w:r>
-      <w:r>
-        <w:t xml:space="preserve">, only making </w:t>
-      </w:r>
-      <w:r>
-        <w:t xml:space="preserve">$5,252 </w:t>
-      </w:r>
-      <w:r>
-        <w:t>but way less than the</w:t>
-      </w:r>
-      <w:r>
-        <w:t xml:space="preserve"> 10 / 19 / 28 </w:t>
-      </w:r>
-      <w:proofErr w:type="spellStart"/>
-      <w:r>
-        <w:t>split.</w:t>
-      </w:r>
-      <w:proofErr w:type="spellEnd"/>
-    </w:p>
-    <w:p>
-      <w:pPr>
-        <w:pStyle w:val="NormalWeb"/>
-      </w:pPr>
-      <w:r>
-        <w:t xml:space="preserve">I instinctually thought </w:t>
-      </w:r>
-      <w:r>
-        <w:t>that tomatoes</w:t>
-      </w:r>
-      <w:r>
-        <w:t xml:space="preserve"> having </w:t>
-      </w:r>
-      <w:proofErr w:type="gramStart"/>
-      <w:r>
-        <w:t xml:space="preserve">a </w:t>
-      </w:r>
-      <w:r>
-        <w:t xml:space="preserve"> high</w:t>
-      </w:r>
-      <w:proofErr w:type="gramEnd"/>
-      <w:r>
-        <w:t xml:space="preserve"> price needed to be balanced against </w:t>
-      </w:r>
-      <w:r>
-        <w:t>the</w:t>
-      </w:r>
-      <w:r>
-        <w:t xml:space="preserve"> labor cost</w:t>
-      </w:r>
-      <w:r>
-        <w:t xml:space="preserve"> and </w:t>
-      </w:r>
-      <w:r>
-        <w:t xml:space="preserve">carrots and mesclun's </w:t>
-      </w:r>
-      <w:r>
-        <w:t xml:space="preserve">having </w:t>
-      </w:r>
-      <w:r>
-        <w:t xml:space="preserve">diminishing returns meant more of them </w:t>
-      </w:r>
-      <w:r>
-        <w:t>better</w:t>
-      </w:r>
-      <w:r>
-        <w:t xml:space="preserve">. </w:t>
-      </w:r>
-      <w:r>
-        <w:t xml:space="preserve">It was still that </w:t>
-      </w:r>
-      <w:r>
-        <w:t>mesclun gets the most beds, tomatoes the fewest</w:t>
-      </w:r>
-      <w:r>
-        <w:t xml:space="preserve">. </w:t>
-      </w:r>
-      <w:proofErr w:type="spellStart"/>
-      <w:r>
-        <w:t>T</w:t>
-      </w:r>
-      <w:r>
-        <w:t>the</w:t>
-      </w:r>
-      <w:proofErr w:type="spellEnd"/>
-      <w:r>
-        <w:t xml:space="preserve"> model shows tomatoes have a </w:t>
-      </w:r>
-      <w:r>
-        <w:t>calculatable</w:t>
-      </w:r>
-      <w:r>
-        <w:t xml:space="preserve"> stopping so 10 is the real limit</w:t>
-      </w:r>
-      <w:r>
-        <w:t xml:space="preserve"> instead of</w:t>
-      </w:r>
-      <w:r>
-        <w:t xml:space="preserve"> 7. </w:t>
-      </w:r>
-      <w:r>
-        <w:t xml:space="preserve">I was mostly wrong about </w:t>
-      </w:r>
-      <w:r>
-        <w:t>mesclun,</w:t>
-      </w:r>
-      <w:r>
-        <w:t xml:space="preserve"> </w:t>
-      </w:r>
-      <w:r>
-        <w:t>the</w:t>
-      </w:r>
-      <w:r>
-        <w:t xml:space="preserve"> diminishing-</w:t>
-      </w:r>
-      <w:proofErr w:type="gramStart"/>
-      <w:r>
-        <w:t xml:space="preserve">returns  </w:t>
-      </w:r>
-      <w:r>
-        <w:t>isn’t</w:t>
-      </w:r>
-      <w:proofErr w:type="gramEnd"/>
-      <w:r>
-        <w:t xml:space="preserve"> that bad so I should have added more. </w:t>
-      </w:r>
-      <w:r>
-        <w:t xml:space="preserve"> </w:t>
-      </w:r>
-      <w:r>
-        <w:t xml:space="preserve">However, </w:t>
-      </w:r>
-      <w:r>
-        <w:t xml:space="preserve">my plan only needed 2 temp workers; the </w:t>
-      </w:r>
-      <w:r>
-        <w:t>analyzed</w:t>
-      </w:r>
-      <w:r>
-        <w:t xml:space="preserve"> plan needs 3</w:t>
-      </w:r>
-      <w:r>
-        <w:t xml:space="preserve">, but </w:t>
-      </w:r>
-      <w:proofErr w:type="spellStart"/>
-      <w:r>
-        <w:t>its</w:t>
-      </w:r>
-      <w:proofErr w:type="spellEnd"/>
-      <w:r>
-        <w:t xml:space="preserve"> worth it in the end for profit.</w:t>
+        <w:t xml:space="preserve">I instinctually thought that tomatoes having a  high price needed to be balanced against the labor cost and carrots and mesclun's having diminishing returns meant more of them better. It was still that mesclun gets the most beds, tomatoes the fewest. Tthe model shows tomatoes have a calculatable stopping so 10 is the real limit instead of 7. I was mostly wrong about mesclun, the diminishing-returns  isn’t that bad so I should have added more.  However, my plan only needed 2 temp workers; the analyzed plan needs 3, but its worth it in the end for profit.</w:t>
       </w:r>
     </w:p>
     <w:p>

</xml_diff>